<commit_message>
fix(tv3): cap nhat speaker notes slide 9, hoan thien bao cao word va dong bo provenance PR #43
</commit_message>
<xml_diff>
--- a/Bo_nop_TV3_TranTienDat/Minh_chung/TV3_Phan_Bao_Cao.docx
+++ b/Bo_nop_TV3_TranTienDat/Minh_chung/TV3_Phan_Bao_Cao.docx
@@ -375,6 +375,10 @@
             <w:insideH w:val="single" w:color="auto" w:sz="4" w:space="0"/>
             <w:insideV w:val="single" w:color="auto" w:sz="4" w:space="0"/>
           </w:tblBorders>
+          <w:tblCellMar>
+            <w:left w:w="108" w:type="dxa"/>
+            <w:right w:w="108" w:type="dxa"/>
+          </w:tblCellMar>
         </w:tblPrEx>
         <w:tc>
           <w:tcPr>
@@ -1138,10 +1142,6 @@
             <w:insideH w:val="single" w:color="auto" w:sz="4" w:space="0"/>
             <w:insideV w:val="single" w:color="auto" w:sz="4" w:space="0"/>
           </w:tblBorders>
-          <w:tblCellMar>
-            <w:left w:w="108" w:type="dxa"/>
-            <w:right w:w="108" w:type="dxa"/>
-          </w:tblCellMar>
         </w:tblPrEx>
         <w:tc>
           <w:tcPr>
@@ -1886,6 +1886,29 @@
     </w:tbl>
     <w:p>
       <w:pPr>
+        <w:rPr>
+          <w:rFonts w:hint="default" w:ascii="Times New Roman" w:hAnsi="Times New Roman" w:cs="Times New Roman"/>
+          <w:b/>
+          <w:bCs/>
+          <w:color w:val="auto"/>
+          <w:sz w:val="26"/>
+          <w:szCs w:val="26"/>
+        </w:rPr>
+      </w:pPr>
+      <w:r>
+        <w:rPr>
+          <w:rFonts w:hint="default" w:ascii="Times New Roman" w:hAnsi="Times New Roman" w:cs="Times New Roman"/>
+          <w:b/>
+          <w:bCs/>
+          <w:color w:val="auto"/>
+          <w:sz w:val="26"/>
+          <w:szCs w:val="26"/>
+        </w:rPr>
+        <w:br w:type="page"/>
+      </w:r>
+    </w:p>
+    <w:p>
+      <w:pPr>
         <w:numPr>
           <w:ilvl w:val="1"/>
           <w:numId w:val="7"/>
@@ -1899,6 +1922,8 @@
           <w:szCs w:val="26"/>
         </w:rPr>
       </w:pPr>
+      <w:bookmarkStart w:id="0" w:name="_GoBack"/>
+      <w:bookmarkEnd w:id="0"/>
       <w:r>
         <w:rPr>
           <w:rFonts w:hint="default" w:ascii="Times New Roman" w:hAnsi="Times New Roman" w:cs="Times New Roman"/>
@@ -3719,7 +3744,7 @@
                 <w:vertAlign w:val="baseline"/>
                 <w:lang w:val="en-US"/>
               </w:rPr>
-              <w:t>GhiChu</w:t>
+              <w:t>LyDo</w:t>
             </w:r>
           </w:p>
         </w:tc>
@@ -3861,21 +3886,9 @@
                 <w:sz w:val="26"/>
                 <w:szCs w:val="26"/>
                 <w:vertAlign w:val="baseline"/>
-              </w:rPr>
-              <w:t xml:space="preserve">Ghi chú chi tiết khoản </w:t>
-            </w:r>
-            <w:r>
-              <w:rPr>
-                <w:rFonts w:hint="default" w:ascii="Times New Roman" w:hAnsi="Times New Roman" w:cs="Times New Roman"/>
-                <w:b w:val="0"/>
-                <w:bCs w:val="0"/>
-                <w:color w:val="auto"/>
-                <w:sz w:val="26"/>
-                <w:szCs w:val="26"/>
-                <w:vertAlign w:val="baseline"/>
                 <w:lang w:val="en-US"/>
               </w:rPr>
-              <w:t>khấu trừ</w:t>
+              <w:t>Lý do khấu trừ</w:t>
             </w:r>
           </w:p>
         </w:tc>
@@ -4255,10 +4268,6 @@
             <w:insideH w:val="single" w:color="auto" w:sz="4" w:space="0"/>
             <w:insideV w:val="single" w:color="auto" w:sz="4" w:space="0"/>
           </w:tblBorders>
-          <w:tblCellMar>
-            <w:left w:w="108" w:type="dxa"/>
-            <w:right w:w="108" w:type="dxa"/>
-          </w:tblCellMar>
         </w:tblPrEx>
         <w:tc>
           <w:tcPr>
@@ -5101,8 +5110,6 @@
           <w:lang w:val="en-US"/>
         </w:rPr>
       </w:pPr>
-      <w:bookmarkStart w:id="0" w:name="_GoBack"/>
-      <w:bookmarkEnd w:id="0"/>
     </w:p>
     <w:sectPr>
       <w:footerReference r:id="rId5" w:type="default"/>

</xml_diff>

<commit_message>
docs(tv5): correct TV3 handoff references and provenance
</commit_message>
<xml_diff>
--- a/Bo_nop_TV3_TranTienDat/Minh_chung/TV3_Phan_Bao_Cao.docx
+++ b/Bo_nop_TV3_TranTienDat/Minh_chung/TV3_Phan_Bao_Cao.docx
@@ -4231,7 +4231,7 @@
           <w:szCs w:val="26"/>
           <w:lang w:val="en-US"/>
         </w:rPr>
-        <w:t>Môi trường thực thi: SQL Server (build 17.0.1000.7, ShowPlan XML version 1.599) tại máy cục bộ, nhánh bàn giao PR #43 (base commit b2e046c). Toàn bộ file log và actual plan hiện hành được đóng gói trực tiếp trong Bo_nop_TV3_TranTienDat/Minh_chung/.</w:t>
+        <w:t>Môi trường ghi nhận: SQL Server 17.0.1000.7, ShowPlan XML 1.599, máy cục bộ. b2e046c là base PR #43; chưa xác minh commit SQL đã chạy. Log và actual plan nằm trong Bo_nop_TV3_TranTienDat/Minh_chung/.</w:t>
       </w:r>
     </w:p>
     <w:tbl>
@@ -4884,7 +4884,7 @@
                 <w:vertAlign w:val="baseline"/>
                 <w:lang w:val="en-US"/>
               </w:rPr>
-              <w:t>Các ảnh trong Ảnh_Chụp/ trùng byte với screenshots/TV3/ (chụp đợt 30/09–06/10 trên bảng thường có DBCC 643 → 2 reads và giao diện kỳ 9/2026). Chỉ dùng để minh họa trực quan bố cục giao diện và thông báo lỗi.</w:t>
+              <w:t>Các ảnh trong Minh_chung/Screenshots/ trùng byte với screenshots/TV3/ (chụp đợt 30/09–06/10 trên bảng thường có DBCC 643 → 2 reads và giao diện kỳ 9/2026). Chỉ dùng để minh họa trực quan bố cục giao diện và thông báo lỗi.</w:t>
             </w:r>
           </w:p>
         </w:tc>

</xml_diff>